<commit_message>
fix(document): handle merged cells in table extraction
Horizontal merges: gridSpan-based empty string placeholders.
Vertical merge continuations: '^' marker via direct vMerge XML check.

Uses raw tr_lst/tc_lst instead of row.cells — python-docx .cells
deduplicates merged cells transparently, making continuation detection
impossible.

Includes fixture update with horizontal/vertical merge examples and
regression tests for both merge types.
</commit_message>
<xml_diff>
--- a/word_parser/tests/sample.docx
+++ b/word_parser/tests/sample.docx
@@ -642,6 +642,209 @@
         </w:tc>
       </w:tr>
     </w:tbl>
+    <w:p>
+      <w:pPr>
+        <w:pStyle w:val="Heading1"/>
+      </w:pPr>
+      <w:r>
+        <w:t>4. 병합 셀 예시</w:t>
+      </w:r>
+    </w:p>
+    <w:p>
+      <w:r>
+        <w:t>가로/세로 병합 셀이 포함된 표 예시입니다.</w:t>
+      </w:r>
+    </w:p>
+    <w:p>
+      <w:pPr>
+        <w:pStyle w:val="Heading2"/>
+      </w:pPr>
+      <w:r>
+        <w:t>4.1 가로 병합</w:t>
+      </w:r>
+    </w:p>
+    <w:tbl>
+      <w:tblPr>
+        <w:tblStyle w:val="TableGrid"/>
+        <w:tblW w:type="auto" w:w="0"/>
+        <w:tblLook w:firstColumn="1" w:firstRow="1" w:lastColumn="0" w:lastRow="0" w:noHBand="0" w:noVBand="1" w:val="04A0"/>
+      </w:tblPr>
+      <w:tblGrid>
+        <w:gridCol w:w="2880"/>
+        <w:gridCol w:w="2880"/>
+        <w:gridCol w:w="2880"/>
+      </w:tblGrid>
+      <w:tr>
+        <w:tc>
+          <w:tcPr>
+            <w:tcW w:type="dxa" w:w="5760"/>
+            <w:gridSpan w:val="2"/>
+          </w:tcPr>
+          <w:p>
+            <w:r>
+              <w:t>병합된 헤더</w:t>
+            </w:r>
+          </w:p>
+        </w:tc>
+        <w:tc>
+          <w:tcPr>
+            <w:tcW w:type="dxa" w:w="2880"/>
+          </w:tcPr>
+          <w:p>
+            <w:r>
+              <w:t>C</w:t>
+            </w:r>
+          </w:p>
+        </w:tc>
+      </w:tr>
+      <w:tr>
+        <w:tc>
+          <w:tcPr>
+            <w:tcW w:type="dxa" w:w="2880"/>
+          </w:tcPr>
+          <w:p>
+            <w:r>
+              <w:t>A1</w:t>
+            </w:r>
+          </w:p>
+        </w:tc>
+        <w:tc>
+          <w:tcPr>
+            <w:tcW w:type="dxa" w:w="2880"/>
+          </w:tcPr>
+          <w:p>
+            <w:r>
+              <w:t>B1</w:t>
+            </w:r>
+          </w:p>
+        </w:tc>
+        <w:tc>
+          <w:tcPr>
+            <w:tcW w:type="dxa" w:w="2880"/>
+          </w:tcPr>
+          <w:p>
+            <w:r>
+              <w:t>C1</w:t>
+            </w:r>
+          </w:p>
+        </w:tc>
+      </w:tr>
+      <w:tr>
+        <w:tc>
+          <w:tcPr>
+            <w:tcW w:type="dxa" w:w="2880"/>
+          </w:tcPr>
+          <w:p>
+            <w:r>
+              <w:t>A2</w:t>
+            </w:r>
+          </w:p>
+        </w:tc>
+        <w:tc>
+          <w:tcPr>
+            <w:tcW w:type="dxa" w:w="2880"/>
+          </w:tcPr>
+          <w:p>
+            <w:r>
+              <w:t>B2</w:t>
+            </w:r>
+          </w:p>
+        </w:tc>
+        <w:tc>
+          <w:tcPr>
+            <w:tcW w:type="dxa" w:w="2880"/>
+          </w:tcPr>
+          <w:p>
+            <w:r>
+              <w:t>C2</w:t>
+            </w:r>
+          </w:p>
+        </w:tc>
+      </w:tr>
+    </w:tbl>
+    <w:p>
+      <w:pPr>
+        <w:pStyle w:val="Heading2"/>
+      </w:pPr>
+      <w:r>
+        <w:t>4.2 세로 병합</w:t>
+      </w:r>
+    </w:p>
+    <w:tbl>
+      <w:tblPr>
+        <w:tblStyle w:val="TableGrid"/>
+        <w:tblW w:type="auto" w:w="0"/>
+        <w:tblLook w:firstColumn="1" w:firstRow="1" w:lastColumn="0" w:lastRow="0" w:noHBand="0" w:noVBand="1" w:val="04A0"/>
+      </w:tblPr>
+      <w:tblGrid>
+        <w:gridCol w:w="4320"/>
+        <w:gridCol w:w="4320"/>
+      </w:tblGrid>
+      <w:tr>
+        <w:tc>
+          <w:tcPr>
+            <w:tcW w:type="dxa" w:w="4320"/>
+          </w:tcPr>
+          <w:p>
+            <w:r>
+              <w:t>헤더1</w:t>
+            </w:r>
+          </w:p>
+        </w:tc>
+        <w:tc>
+          <w:tcPr>
+            <w:tcW w:type="dxa" w:w="4320"/>
+          </w:tcPr>
+          <w:p>
+            <w:r>
+              <w:t>헤더2</w:t>
+            </w:r>
+          </w:p>
+        </w:tc>
+      </w:tr>
+      <w:tr>
+        <w:tc>
+          <w:tcPr>
+            <w:tcW w:type="dxa" w:w="4320"/>
+            <w:vMerge w:val="restart"/>
+          </w:tcPr>
+          <w:p>
+            <w:r>
+              <w:t>병합됨</w:t>
+            </w:r>
+          </w:p>
+        </w:tc>
+        <w:tc>
+          <w:tcPr>
+            <w:tcW w:type="dxa" w:w="4320"/>
+          </w:tcPr>
+          <w:p>
+            <w:r>
+              <w:t>값1</w:t>
+            </w:r>
+          </w:p>
+        </w:tc>
+      </w:tr>
+      <w:tr>
+        <w:tc>
+          <w:tcPr>
+            <w:tcW w:type="dxa" w:w="4320"/>
+            <w:vMerge/>
+          </w:tcPr>
+          <w:p/>
+        </w:tc>
+        <w:tc>
+          <w:tcPr>
+            <w:tcW w:type="dxa" w:w="4320"/>
+          </w:tcPr>
+          <w:p>
+            <w:r>
+              <w:t>값2</w:t>
+            </w:r>
+          </w:p>
+        </w:tc>
+      </w:tr>
+    </w:tbl>
     <w:sectPr>
       <w:pgSz w:w="12240" w:h="15840"/>
       <w:pgMar w:top="1440" w:right="1800" w:bottom="1440" w:left="1800" w:header="720" w:footer="720" w:gutter="0"/>

</xml_diff>